<commit_message>
fix: reutilizar Python y uv si ya están instalados
El instalador de Windows solo descarga uv o Python 3.12 cuando no los encuentra.

Co-authored-by: Cursor <cursoragent@cursor.com>
</commit_message>
<xml_diff>
--- a/INSTALACION-WINDOWS.docx
+++ b/INSTALACION-WINDOWS.docx
@@ -222,6 +222,19 @@
           <w:sz w:val="24"/>
         </w:rPr>
         <w:t>No escriba nada. Espere. La primera vez puede tardar varios minutos.</w:t>
+      </w:r>
+    </w:p>
+    <w:p>
+      <w:pPr>
+        <w:spacing w:after="160"/>
+      </w:pPr>
+      <w:r>
+        <w:rPr>
+          <w:rFonts w:ascii="Calibri" w:hAnsi="Calibri"/>
+          <w:b w:val="0"/>
+          <w:sz w:val="24"/>
+        </w:rPr>
+        <w:t>Si Python o uv ya están en la computadora, el instalador los usa y no los vuelve a instalar.</w:t>
       </w:r>
     </w:p>
     <w:p>

</xml_diff>

<commit_message>
feat: separar voces en entrevistas solo si el equipo puede instalarlo
La transcripción normal no cambia. El extra queda apagado y el dictamen revisa memoria y disco antes de bajar PyTorch.

Co-authored-by: Cursor <cursoragent@cursor.com>
</commit_message>
<xml_diff>
--- a/INSTALACION-WINDOWS.docx
+++ b/INSTALACION-WINDOWS.docx
@@ -418,6 +418,43 @@
         <w:rPr>
           <w:color w:val="1F4E79"/>
         </w:rPr>
+        <w:t>Separar quién habla en una entrevista</w:t>
+      </w:r>
+    </w:p>
+    <w:p>
+      <w:pPr>
+        <w:spacing w:after="160"/>
+      </w:pPr>
+      <w:r>
+        <w:rPr>
+          <w:rFonts w:ascii="Calibri" w:hAnsi="Calibri"/>
+          <w:b w:val="0"/>
+          <w:sz w:val="24"/>
+        </w:rPr>
+        <w:t>Al terminar la instalación, la ventana dice si esa computadora puede separar las voces (quién habla). Hacen falta al menos 12 GB de memoria y unos 6 GB libres en disco. No se instala solo: el icono Transcribir no lo usa, y la transcripción normal sigue igual.</w:t>
+      </w:r>
+    </w:p>
+    <w:p>
+      <w:pPr>
+        <w:spacing w:after="160"/>
+      </w:pPr>
+      <w:r>
+        <w:rPr>
+          <w:rFonts w:ascii="Calibri" w:hAnsi="Calibri"/>
+          <w:b w:val="0"/>
+          <w:sz w:val="24"/>
+        </w:rPr>
+        <w:t>Si el dictamen dice que sí se puede, y de verdad lo necesita, quien instaló el programa abre la carpeta stt-main y ejecuta .venv\Scripts\stt.exe voces. La primera vez pide internet y una cuenta gratuita de Hugging Face para bajar el modelo. El audio no se envía a internet.</w:t>
+      </w:r>
+    </w:p>
+    <w:p>
+      <w:pPr>
+        <w:pStyle w:val="Heading1"/>
+      </w:pPr>
+      <w:r>
+        <w:rPr>
+          <w:color w:val="1F4E79"/>
+        </w:rPr>
         <w:t>Si más adelante quiere otra carpeta</w:t>
       </w:r>
     </w:p>

</xml_diff>

<commit_message>
feat: auditar el modelo de Whisper al instalarlo y fijar la descarga
La instalación solo acepta los pesos oficiales de Systran, por huella y formato, y el instalador de Windows deja de seguir la rama main.

Co-authored-by: Cursor <cursoragent@cursor.com>
</commit_message>
<xml_diff>
--- a/INSTALACION-WINDOWS.docx
+++ b/INSTALACION-WINDOWS.docx
@@ -95,7 +95,7 @@
           <w:b w:val="0"/>
           <w:sz w:val="24"/>
         </w:rPr>
-        <w:t>https://github.com/pathros/stt/archive/refs/heads/main.zip</w:t>
+        <w:t>https://github.com/pathros/stt/archive/refs/tags/v0.1.0.zip</w:t>
       </w:r>
     </w:p>
     <w:p>
@@ -171,7 +171,7 @@
           <w:b w:val="0"/>
           <w:sz w:val="24"/>
         </w:rPr>
-        <w:t>Se abre una carpeta llamada stt-main. Entre en ella.</w:t>
+        <w:t>Se abre una carpeta cuyo nombre empieza por stt. Entre en ella.</w:t>
       </w:r>
     </w:p>
     <w:p>
@@ -195,7 +195,7 @@
           <w:b w:val="0"/>
           <w:sz w:val="24"/>
         </w:rPr>
-        <w:t>Dentro de stt-main, doble clic en Instalar.bat.</w:t>
+        <w:t>Dentro de esa carpeta, doble clic en Instalar.bat.</w:t>
       </w:r>
     </w:p>
     <w:p>
@@ -310,7 +310,7 @@
           <w:b w:val="0"/>
           <w:sz w:val="24"/>
         </w:rPr>
-        <w:t>La primera transcripción descarga el modelo de idioma y tarda más. Las siguientes, menos.</w:t>
+        <w:t>La instalación descarga el modelo de idioma y comprueba que sea el oficial. La primera transcripción puede tardar un poco más en cargarlo.</w:t>
       </w:r>
     </w:p>
     <w:p>
@@ -444,7 +444,7 @@
           <w:b w:val="0"/>
           <w:sz w:val="24"/>
         </w:rPr>
-        <w:t>Si el dictamen dice que sí se puede, y de verdad lo necesita, quien instaló el programa abre la carpeta stt-main y ejecuta .venv\Scripts\stt.exe voces. La primera vez pide internet y una cuenta gratuita de Hugging Face para bajar el modelo. El audio no se envía a internet.</w:t>
+        <w:t>Si el dictamen dice que sí se puede, y de verdad lo necesita, quien instaló el programa abre la carpeta del programa y ejecuta .venv\Scripts\stt.exe voces. La primera vez pide internet y una cuenta gratuita de Hugging Face para bajar el modelo. El audio no se envía a internet.</w:t>
       </w:r>
     </w:p>
     <w:p>

</xml_diff>

<commit_message>
fix: publicar la huella SHA-256 del ZIP v0.1.0
El instalador rechaza una descarga que no sea exactamente esa versión etiquetada.

Co-authored-by: Cursor <cursoragent@cursor.com>
</commit_message>
<xml_diff>
--- a/INSTALACION-WINDOWS.docx
+++ b/INSTALACION-WINDOWS.docx
@@ -171,7 +171,7 @@
           <w:b w:val="0"/>
           <w:sz w:val="24"/>
         </w:rPr>
-        <w:t>Se abre una carpeta cuyo nombre empieza por stt. Entre en ella.</w:t>
+        <w:t>Se abre una carpeta llamada stt-0.1.0. Entre en ella.</w:t>
       </w:r>
     </w:p>
     <w:p>
@@ -195,7 +195,7 @@
           <w:b w:val="0"/>
           <w:sz w:val="24"/>
         </w:rPr>
-        <w:t>Dentro de esa carpeta, doble clic en Instalar.bat.</w:t>
+        <w:t>Dentro de stt-0.1.0, doble clic en Instalar.bat.</w:t>
       </w:r>
     </w:p>
     <w:p>

</xml_diff>

<commit_message>
docs: README con capturas y la misma salida en Mac y Windows
La carpeta por defecto pasa a ser Descargas en los dos sistemas. Word se puede elegir en ambos; en Windows el instalador lo deja activo.

Co-authored-by: Cursor <cursoragent@cursor.com>
</commit_message>
<xml_diff>
--- a/INSTALACION-WINDOWS.docx
+++ b/INSTALACION-WINDOWS.docx
@@ -323,7 +323,7 @@
           <w:b w:val="0"/>
           <w:sz w:val="24"/>
         </w:rPr>
-        <w:t>Al terminar, el Word está en Documentos, dentro de la carpeta Transcripciones.</w:t>
+        <w:t>Al terminar, el Word está en la carpeta Descargas.</w:t>
       </w:r>
     </w:p>
     <w:p>
@@ -371,7 +371,7 @@
           <w:rFonts w:ascii="Calibri" w:hAnsi="Calibri"/>
           <w:sz w:val="24"/>
         </w:rPr>
-        <w:t>La carpeta es Documentos\Transcripciones.</w:t>
+        <w:t>La carpeta es Descargas.</w:t>
       </w:r>
     </w:p>
     <w:p>

</xml_diff>